<commit_message>
Polish final thesis document and references
</commit_message>
<xml_diff>
--- a/thesis/abstract_tesi.docx
+++ b/thesis/abstract_tesi.docx
@@ -693,7 +693,7 @@
     <w:link w:val="Titolo1Carattere"/>
     <w:uiPriority w:val="9"/>
     <w:qFormat/>
-    <w:rsid w:val="00927EE7"/>
+    <w:rsid w:val="000728B1"/>
     <w:pPr>
       <w:keepNext/>
       <w:keepLines/>
@@ -716,7 +716,7 @@
     <w:semiHidden/>
     <w:unhideWhenUsed/>
     <w:qFormat/>
-    <w:rsid w:val="00927EE7"/>
+    <w:rsid w:val="000728B1"/>
     <w:pPr>
       <w:keepNext/>
       <w:keepLines/>
@@ -739,7 +739,7 @@
     <w:semiHidden/>
     <w:unhideWhenUsed/>
     <w:qFormat/>
-    <w:rsid w:val="00927EE7"/>
+    <w:rsid w:val="000728B1"/>
     <w:pPr>
       <w:keepNext/>
       <w:keepLines/>
@@ -762,7 +762,7 @@
     <w:semiHidden/>
     <w:unhideWhenUsed/>
     <w:qFormat/>
-    <w:rsid w:val="00927EE7"/>
+    <w:rsid w:val="000728B1"/>
     <w:pPr>
       <w:keepNext/>
       <w:keepLines/>
@@ -785,7 +785,7 @@
     <w:semiHidden/>
     <w:unhideWhenUsed/>
     <w:qFormat/>
-    <w:rsid w:val="00927EE7"/>
+    <w:rsid w:val="000728B1"/>
     <w:pPr>
       <w:keepNext/>
       <w:keepLines/>
@@ -806,7 +806,7 @@
     <w:semiHidden/>
     <w:unhideWhenUsed/>
     <w:qFormat/>
-    <w:rsid w:val="00927EE7"/>
+    <w:rsid w:val="000728B1"/>
     <w:pPr>
       <w:keepNext/>
       <w:keepLines/>
@@ -829,7 +829,7 @@
     <w:semiHidden/>
     <w:unhideWhenUsed/>
     <w:qFormat/>
-    <w:rsid w:val="00927EE7"/>
+    <w:rsid w:val="000728B1"/>
     <w:pPr>
       <w:keepNext/>
       <w:keepLines/>
@@ -850,7 +850,7 @@
     <w:semiHidden/>
     <w:unhideWhenUsed/>
     <w:qFormat/>
-    <w:rsid w:val="00927EE7"/>
+    <w:rsid w:val="000728B1"/>
     <w:pPr>
       <w:keepNext/>
       <w:keepLines/>
@@ -873,7 +873,7 @@
     <w:semiHidden/>
     <w:unhideWhenUsed/>
     <w:qFormat/>
-    <w:rsid w:val="00927EE7"/>
+    <w:rsid w:val="000728B1"/>
     <w:pPr>
       <w:keepNext/>
       <w:keepLines/>
@@ -917,7 +917,7 @@
     <w:basedOn w:val="Carpredefinitoparagrafo"/>
     <w:link w:val="Titolo1"/>
     <w:uiPriority w:val="9"/>
-    <w:rsid w:val="00927EE7"/>
+    <w:rsid w:val="000728B1"/>
     <w:rPr>
       <w:rFonts w:asciiTheme="majorHAnsi" w:eastAsiaTheme="majorEastAsia" w:hAnsiTheme="majorHAnsi" w:cstheme="majorBidi"/>
       <w:color w:val="2F5496" w:themeColor="accent1" w:themeShade="BF"/>
@@ -931,7 +931,7 @@
     <w:link w:val="Titolo2"/>
     <w:uiPriority w:val="9"/>
     <w:semiHidden/>
-    <w:rsid w:val="00927EE7"/>
+    <w:rsid w:val="000728B1"/>
     <w:rPr>
       <w:rFonts w:asciiTheme="majorHAnsi" w:eastAsiaTheme="majorEastAsia" w:hAnsiTheme="majorHAnsi" w:cstheme="majorBidi"/>
       <w:color w:val="2F5496" w:themeColor="accent1" w:themeShade="BF"/>
@@ -945,7 +945,7 @@
     <w:link w:val="Titolo3"/>
     <w:uiPriority w:val="9"/>
     <w:semiHidden/>
-    <w:rsid w:val="00927EE7"/>
+    <w:rsid w:val="000728B1"/>
     <w:rPr>
       <w:rFonts w:eastAsiaTheme="majorEastAsia" w:cstheme="majorBidi"/>
       <w:color w:val="2F5496" w:themeColor="accent1" w:themeShade="BF"/>
@@ -959,7 +959,7 @@
     <w:link w:val="Titolo4"/>
     <w:uiPriority w:val="9"/>
     <w:semiHidden/>
-    <w:rsid w:val="00927EE7"/>
+    <w:rsid w:val="000728B1"/>
     <w:rPr>
       <w:rFonts w:eastAsiaTheme="majorEastAsia" w:cstheme="majorBidi"/>
       <w:i/>
@@ -973,7 +973,7 @@
     <w:link w:val="Titolo5"/>
     <w:uiPriority w:val="9"/>
     <w:semiHidden/>
-    <w:rsid w:val="00927EE7"/>
+    <w:rsid w:val="000728B1"/>
     <w:rPr>
       <w:rFonts w:eastAsiaTheme="majorEastAsia" w:cstheme="majorBidi"/>
       <w:color w:val="2F5496" w:themeColor="accent1" w:themeShade="BF"/>
@@ -985,7 +985,7 @@
     <w:link w:val="Titolo6"/>
     <w:uiPriority w:val="9"/>
     <w:semiHidden/>
-    <w:rsid w:val="00927EE7"/>
+    <w:rsid w:val="000728B1"/>
     <w:rPr>
       <w:rFonts w:eastAsiaTheme="majorEastAsia" w:cstheme="majorBidi"/>
       <w:i/>
@@ -999,7 +999,7 @@
     <w:link w:val="Titolo7"/>
     <w:uiPriority w:val="9"/>
     <w:semiHidden/>
-    <w:rsid w:val="00927EE7"/>
+    <w:rsid w:val="000728B1"/>
     <w:rPr>
       <w:rFonts w:eastAsiaTheme="majorEastAsia" w:cstheme="majorBidi"/>
       <w:color w:val="595959" w:themeColor="text1" w:themeTint="A6"/>
@@ -1011,7 +1011,7 @@
     <w:link w:val="Titolo8"/>
     <w:uiPriority w:val="9"/>
     <w:semiHidden/>
-    <w:rsid w:val="00927EE7"/>
+    <w:rsid w:val="000728B1"/>
     <w:rPr>
       <w:rFonts w:eastAsiaTheme="majorEastAsia" w:cstheme="majorBidi"/>
       <w:i/>
@@ -1025,7 +1025,7 @@
     <w:link w:val="Titolo9"/>
     <w:uiPriority w:val="9"/>
     <w:semiHidden/>
-    <w:rsid w:val="00927EE7"/>
+    <w:rsid w:val="000728B1"/>
     <w:rPr>
       <w:rFonts w:eastAsiaTheme="majorEastAsia" w:cstheme="majorBidi"/>
       <w:color w:val="272727" w:themeColor="text1" w:themeTint="D8"/>
@@ -1038,7 +1038,7 @@
     <w:link w:val="TitoloCarattere"/>
     <w:uiPriority w:val="10"/>
     <w:qFormat/>
-    <w:rsid w:val="00927EE7"/>
+    <w:rsid w:val="000728B1"/>
     <w:pPr>
       <w:spacing w:after="80" w:line="240" w:lineRule="auto"/>
       <w:contextualSpacing/>
@@ -1056,7 +1056,7 @@
     <w:basedOn w:val="Carpredefinitoparagrafo"/>
     <w:link w:val="Titolo"/>
     <w:uiPriority w:val="10"/>
-    <w:rsid w:val="00927EE7"/>
+    <w:rsid w:val="000728B1"/>
     <w:rPr>
       <w:rFonts w:asciiTheme="majorHAnsi" w:eastAsiaTheme="majorEastAsia" w:hAnsiTheme="majorHAnsi" w:cstheme="majorBidi"/>
       <w:spacing w:val="-10"/>
@@ -1072,7 +1072,7 @@
     <w:link w:val="SottotitoloCarattere"/>
     <w:uiPriority w:val="11"/>
     <w:qFormat/>
-    <w:rsid w:val="00927EE7"/>
+    <w:rsid w:val="000728B1"/>
     <w:pPr>
       <w:numPr>
         <w:ilvl w:val="1"/>
@@ -1091,7 +1091,7 @@
     <w:basedOn w:val="Carpredefinitoparagrafo"/>
     <w:link w:val="Sottotitolo"/>
     <w:uiPriority w:val="11"/>
-    <w:rsid w:val="00927EE7"/>
+    <w:rsid w:val="000728B1"/>
     <w:rPr>
       <w:rFonts w:eastAsiaTheme="majorEastAsia" w:cstheme="majorBidi"/>
       <w:color w:val="595959" w:themeColor="text1" w:themeTint="A6"/>
@@ -1107,7 +1107,7 @@
     <w:link w:val="CitazioneCarattere"/>
     <w:uiPriority w:val="29"/>
     <w:qFormat/>
-    <w:rsid w:val="00927EE7"/>
+    <w:rsid w:val="000728B1"/>
     <w:pPr>
       <w:spacing w:before="160"/>
       <w:jc w:val="center"/>
@@ -1123,7 +1123,7 @@
     <w:basedOn w:val="Carpredefinitoparagrafo"/>
     <w:link w:val="Citazione"/>
     <w:uiPriority w:val="29"/>
-    <w:rsid w:val="00927EE7"/>
+    <w:rsid w:val="000728B1"/>
     <w:rPr>
       <w:i/>
       <w:iCs/>
@@ -1135,7 +1135,7 @@
     <w:basedOn w:val="Normale"/>
     <w:uiPriority w:val="34"/>
     <w:qFormat/>
-    <w:rsid w:val="00927EE7"/>
+    <w:rsid w:val="000728B1"/>
     <w:pPr>
       <w:ind w:left="720"/>
       <w:contextualSpacing/>
@@ -1146,7 +1146,7 @@
     <w:basedOn w:val="Carpredefinitoparagrafo"/>
     <w:uiPriority w:val="21"/>
     <w:qFormat/>
-    <w:rsid w:val="00927EE7"/>
+    <w:rsid w:val="000728B1"/>
     <w:rPr>
       <w:i/>
       <w:iCs/>
@@ -1160,7 +1160,7 @@
     <w:link w:val="CitazioneintensaCarattere"/>
     <w:uiPriority w:val="30"/>
     <w:qFormat/>
-    <w:rsid w:val="00927EE7"/>
+    <w:rsid w:val="000728B1"/>
     <w:pPr>
       <w:pBdr>
         <w:top w:val="single" w:sz="4" w:space="10" w:color="2F5496" w:themeColor="accent1" w:themeShade="BF"/>
@@ -1181,7 +1181,7 @@
     <w:basedOn w:val="Carpredefinitoparagrafo"/>
     <w:link w:val="Citazioneintensa"/>
     <w:uiPriority w:val="30"/>
-    <w:rsid w:val="00927EE7"/>
+    <w:rsid w:val="000728B1"/>
     <w:rPr>
       <w:i/>
       <w:iCs/>
@@ -1193,7 +1193,7 @@
     <w:basedOn w:val="Carpredefinitoparagrafo"/>
     <w:uiPriority w:val="32"/>
     <w:qFormat/>
-    <w:rsid w:val="00927EE7"/>
+    <w:rsid w:val="000728B1"/>
     <w:rPr>
       <w:b/>
       <w:bCs/>

</xml_diff>